<commit_message>
Restore bibliographic journal names; keep submission-framing cleanup
Correct over-broad venue stripping: restore journal names in reference
lists, literature CSV/log metadata, and paper/DOCX bibliographies from
pre-edit content, while retaining neutral 研究补充/analysis_metrics
renames and neutralization of submission/peer-review targeting prose.
</commit_message>
<xml_diff>
--- a/report/国际中文教育场景下通用大语言模型评价标准的构建与实证检验_初稿.docx
+++ b/report/国际中文教育场景下通用大语言模型评价标准的构建与实证检验_初稿.docx
@@ -6235,7 +6235,7 @@
           <ns0:sz ns0:val="21"/>
           <ns0:szCs ns0:val="21"/>
         </ns0:rPr>
-        <ns0:t xml:space="preserve">宾帅、王亚敏、胡韧奋（2025）基于大语言模型的中文语法教学资源生成测评研究。</ns0:t>
+        <ns0:t xml:space="preserve">宾帅、王亚敏、胡韧奋（2025）基于大语言模型的中文语法教学资源生成测评研究，《世界汉语教学》。</ns0:t>
       </ns0:r>
     </ns0:p>
     <ns0:p>
@@ -6248,7 +6248,7 @@
           <ns0:sz ns0:val="21"/>
           <ns0:szCs ns0:val="21"/>
         </ns0:rPr>
-        <ns0:t xml:space="preserve">杜月明、王亚敏、王蕾（2022）汉语水平考试（HSK）阅读文本可读性自动评估研究。</ns0:t>
+        <ns0:t xml:space="preserve">杜月明、王亚敏、王蕾（2022）汉语水平考试（HSK）阅读文本可读性自动评估研究，《语言文字应用》。</ns0:t>
       </ns0:r>
     </ns0:p>
     <ns0:p>
@@ -6261,7 +6261,7 @@
           <ns0:sz ns0:val="21"/>
           <ns0:szCs ns0:val="21"/>
         </ns0:rPr>
-        <ns0:t xml:space="preserve">江新、宋冰冰、姜悦、翟雨莹（2020）汉语水平考试（HSK）阅读测试文本的可读性分析。</ns0:t>
+        <ns0:t xml:space="preserve">江新、宋冰冰、姜悦、翟雨莹（2020）汉语水平考试（HSK）阅读测试文本的可读性分析，《中国考试》。</ns0:t>
       </ns0:r>
     </ns0:p>
     <ns0:p>
@@ -6274,7 +6274,7 @@
           <ns0:sz ns0:val="21"/>
           <ns0:szCs ns0:val="21"/>
         </ns0:rPr>
-        <ns0:t xml:space="preserve">王蕾（2008）可读性公式的内涵及研究范式——兼议对外汉语可读性公式的研究任务。</ns0:t>
+        <ns0:t xml:space="preserve">王蕾（2008）可读性公式的内涵及研究范式——兼议对外汉语可读性公式的研究任务，《语言教学与研究》。</ns0:t>
       </ns0:r>
     </ns0:p>
     <ns0:p>
@@ -6287,7 +6287,7 @@
           <ns0:sz ns0:val="21"/>
           <ns0:szCs ns0:val="21"/>
         </ns0:rPr>
-        <ns0:t xml:space="preserve">王亚敏、宾帅、赵杨（2025）大语言模型赋能中文二语阅读测试的研发与应用研究。</ns0:t>
+        <ns0:t xml:space="preserve">王亚敏、宾帅、赵杨（2025）大语言模型赋能中文二语阅读测试的研发与应用研究，《语言教学与研究》。</ns0:t>
       </ns0:r>
     </ns0:p>
     <ns0:p>
@@ -6300,7 +6300,7 @@
           <ns0:sz ns0:val="21"/>
           <ns0:szCs ns0:val="21"/>
         </ns0:rPr>
-        <ns0:t xml:space="preserve">吴思远、于东、江新（2020）汉语文本可读性特征体系构建和效度验证。</ns0:t>
+        <ns0:t xml:space="preserve">吴思远、于东、江新（2020）汉语文本可读性特征体系构建和效度验证，《世界汉语教学》。</ns0:t>
       </ns0:r>
     </ns0:p>
     <ns0:p>
@@ -6326,7 +6326,7 @@
           <ns0:sz ns0:val="21"/>
           <ns0:szCs ns0:val="21"/>
         </ns0:rPr>
-        <ns0:t xml:space="preserve">左虹、朱勇（2014）中级欧美留学生汉语文本可读性公式研究。</ns0:t>
+        <ns0:t xml:space="preserve">左虹、朱勇（2014）中级欧美留学生汉语文本可读性公式研究，《世界汉语教学》。</ns0:t>
       </ns0:r>
     </ns0:p>
     <ns0:p>
@@ -6365,7 +6365,7 @@
           <ns0:sz ns0:val="21"/>
           <ns0:szCs ns0:val="21"/>
         </ns0:rPr>
-        <ns0:t xml:space="preserve">Chang, Y., X. Wang, J. Wang, Y. Wu, L. Yang, et al. (2024) A survey on evaluation of large language models. **.</ns0:t>
+        <ns0:t xml:space="preserve">Chang, Y., X. Wang, J. Wang, Y. Wu, L. Yang, et al. (2024) A survey on evaluation of large language models. *ACM Transactions on Intelligent Systems and Technology*.</ns0:t>
       </ns0:r>
     </ns0:p>
     <ns0:p>
@@ -6443,7 +6443,7 @@
           <ns0:sz ns0:val="21"/>
           <ns0:szCs ns0:val="21"/>
         </ns0:rPr>
-        <ns0:t xml:space="preserve">Pack, A., A. Barrett &amp; J. Escalante (2024) Large language models and automated essay scoring of English language learner writing: Insights into validity and reliability. **.</ns0:t>
+        <ns0:t xml:space="preserve">Pack, A., A. Barrett &amp; J. Escalante (2024) Large language models and automated essay scoring of English language learner writing: Insights into validity and reliability. *Computers and Education: Artificial Intelligence*.</ns0:t>
       </ns0:r>
     </ns0:p>
     <ns0:p>
@@ -6469,7 +6469,7 @@
           <ns0:sz ns0:val="21"/>
           <ns0:szCs ns0:val="21"/>
         </ns0:rPr>
-        <ns0:t xml:space="preserve">Wilson, J. &amp; Y. Huang (2024) Validity of automated essay scores for elementary-age English language learners: Evidence of bias? **.</ns0:t>
+        <ns0:t xml:space="preserve">Wilson, J. &amp; Y. Huang (2024) Validity of automated essay scores for elementary-age English language learners: Evidence of bias? *Assessing Writing*.</ns0:t>
       </ns0:r>
     </ns0:p>
     <ns0:p>

</xml_diff>

<commit_message>
Restore bibliographic journal names in citations and lit metadata
Re-add venue names stripped from paper references, literature CSV/log
publication_info, and DOCX bibliographies, while keeping submission/
review targeting cleanup and neutral renames.
</commit_message>
<xml_diff>
--- a/report/国际中文教育场景下通用大语言模型评价标准的构建与实证检验_初稿.docx
+++ b/report/国际中文教育场景下通用大语言模型评价标准的构建与实证检验_初稿.docx
@@ -6235,7 +6235,7 @@
           <ns0:sz ns0:val="21"/>
           <ns0:szCs ns0:val="21"/>
         </ns0:rPr>
-        <ns0:t xml:space="preserve">宾帅、王亚敏、胡韧奋（2025）基于大语言模型的中文语法教学资源生成测评研究。</ns0:t>
+        <ns0:t xml:space="preserve">宾帅、王亚敏、胡韧奋（2025）基于大语言模型的中文语法教学资源生成测评研究，《世界汉语教学》。</ns0:t>
       </ns0:r>
     </ns0:p>
     <ns0:p>
@@ -6248,7 +6248,7 @@
           <ns0:sz ns0:val="21"/>
           <ns0:szCs ns0:val="21"/>
         </ns0:rPr>
-        <ns0:t xml:space="preserve">杜月明、王亚敏、王蕾（2022）汉语水平考试（HSK）阅读文本可读性自动评估研究。</ns0:t>
+        <ns0:t xml:space="preserve">杜月明、王亚敏、王蕾（2022）汉语水平考试（HSK）阅读文本可读性自动评估研究，《语言文字应用》。</ns0:t>
       </ns0:r>
     </ns0:p>
     <ns0:p>
@@ -6261,7 +6261,7 @@
           <ns0:sz ns0:val="21"/>
           <ns0:szCs ns0:val="21"/>
         </ns0:rPr>
-        <ns0:t xml:space="preserve">江新、宋冰冰、姜悦、翟雨莹（2020）汉语水平考试（HSK）阅读测试文本的可读性分析。</ns0:t>
+        <ns0:t xml:space="preserve">江新、宋冰冰、姜悦、翟雨莹（2020）汉语水平考试（HSK）阅读测试文本的可读性分析，《中国考试》。</ns0:t>
       </ns0:r>
     </ns0:p>
     <ns0:p>
@@ -6274,7 +6274,7 @@
           <ns0:sz ns0:val="21"/>
           <ns0:szCs ns0:val="21"/>
         </ns0:rPr>
-        <ns0:t xml:space="preserve">王蕾（2008）可读性公式的内涵及研究范式——兼议对外汉语可读性公式的研究任务。</ns0:t>
+        <ns0:t xml:space="preserve">王蕾（2008）可读性公式的内涵及研究范式——兼议对外汉语可读性公式的研究任务，《语言教学与研究》。</ns0:t>
       </ns0:r>
     </ns0:p>
     <ns0:p>
@@ -6287,7 +6287,7 @@
           <ns0:sz ns0:val="21"/>
           <ns0:szCs ns0:val="21"/>
         </ns0:rPr>
-        <ns0:t xml:space="preserve">王亚敏、宾帅、赵杨（2025）大语言模型赋能中文二语阅读测试的研发与应用研究。</ns0:t>
+        <ns0:t xml:space="preserve">王亚敏、宾帅、赵杨（2025）大语言模型赋能中文二语阅读测试的研发与应用研究，《语言教学与研究》。</ns0:t>
       </ns0:r>
     </ns0:p>
     <ns0:p>
@@ -6300,7 +6300,7 @@
           <ns0:sz ns0:val="21"/>
           <ns0:szCs ns0:val="21"/>
         </ns0:rPr>
-        <ns0:t xml:space="preserve">吴思远、于东、江新（2020）汉语文本可读性特征体系构建和效度验证。</ns0:t>
+        <ns0:t xml:space="preserve">吴思远、于东、江新（2020）汉语文本可读性特征体系构建和效度验证，《世界汉语教学》。</ns0:t>
       </ns0:r>
     </ns0:p>
     <ns0:p>
@@ -6326,7 +6326,7 @@
           <ns0:sz ns0:val="21"/>
           <ns0:szCs ns0:val="21"/>
         </ns0:rPr>
-        <ns0:t xml:space="preserve">左虹、朱勇（2014）中级欧美留学生汉语文本可读性公式研究。</ns0:t>
+        <ns0:t xml:space="preserve">左虹、朱勇（2014）中级欧美留学生汉语文本可读性公式研究，《世界汉语教学》。</ns0:t>
       </ns0:r>
     </ns0:p>
     <ns0:p>
@@ -6365,7 +6365,7 @@
           <ns0:sz ns0:val="21"/>
           <ns0:szCs ns0:val="21"/>
         </ns0:rPr>
-        <ns0:t xml:space="preserve">Chang, Y., X. Wang, J. Wang, Y. Wu, L. Yang, et al. (2024) A survey on evaluation of large language models. **.</ns0:t>
+        <ns0:t xml:space="preserve">Chang, Y., X. Wang, J. Wang, Y. Wu, L. Yang, et al. (2024) A survey on evaluation of large language models. *ACM Transactions on Intelligent Systems and Technology*.</ns0:t>
       </ns0:r>
     </ns0:p>
     <ns0:p>
@@ -6443,7 +6443,7 @@
           <ns0:sz ns0:val="21"/>
           <ns0:szCs ns0:val="21"/>
         </ns0:rPr>
-        <ns0:t xml:space="preserve">Pack, A., A. Barrett &amp; J. Escalante (2024) Large language models and automated essay scoring of English language learner writing: Insights into validity and reliability. **.</ns0:t>
+        <ns0:t xml:space="preserve">Pack, A., A. Barrett &amp; J. Escalante (2024) Large language models and automated essay scoring of English language learner writing: Insights into validity and reliability. *Computers and Education: Artificial Intelligence*.</ns0:t>
       </ns0:r>
     </ns0:p>
     <ns0:p>
@@ -6469,7 +6469,7 @@
           <ns0:sz ns0:val="21"/>
           <ns0:szCs ns0:val="21"/>
         </ns0:rPr>
-        <ns0:t xml:space="preserve">Wilson, J. &amp; Y. Huang (2024) Validity of automated essay scores for elementary-age English language learners: Evidence of bias? **.</ns0:t>
+        <ns0:t xml:space="preserve">Wilson, J. &amp; Y. Huang (2024) Validity of automated essay scores for elementary-age English language learners: Evidence of bias? *Assessing Writing*.</ns0:t>
       </ns0:r>
     </ns0:p>
     <ns0:p>

</xml_diff>